<commit_message>
update LTP, Lesson breakdown in 2 yrs
</commit_message>
<xml_diff>
--- a/LTP + Lesson slides/0509 中文第一语言 两年长期计划 修订版 含审计与建议.docx
+++ b/LTP + Lesson slides/0509 中文第一语言 两年长期计划 修订版 含审计与建议.docx
@@ -299,18 +299,11 @@
           </w:tcPr>
           <w:p>
             <w:pPr>
-              <w:spacing w:before="0" w:after="0" w:line="252" w:lineRule="auto"/>
               <w:jc w:val="left"/>
             </w:pPr>
-            <w:r/>
             <w:r>
-              <w:rPr>
-                <w:rFonts w:ascii="STHeiti" w:hAnsi="STHeiti" w:eastAsia="STHeiti" w:cs="STHeiti"/>
-                <w:b w:val="0"/>
-                <w:color w:val="1F2937"/>
-                <w:sz w:val="16"/>
-              </w:rPr>
-              <w:t>151 小时：Y10 89 小时，Y11 教学与复习 62 小时。</w:t>
+              <w:rPr/>
+              <w:t>151 小时：Y10 89 小时，Y11 教学、诊断、再教学与模拟 62 小时。</w:t>
             </w:r>
           </w:p>
         </w:tc>
@@ -371,18 +364,11 @@
           </w:tcPr>
           <w:p>
             <w:pPr>
-              <w:spacing w:before="0" w:after="0" w:line="252" w:lineRule="auto"/>
               <w:jc w:val="left"/>
             </w:pPr>
-            <w:r/>
             <w:r>
-              <w:rPr>
-                <w:rFonts w:ascii="STHeiti" w:hAnsi="STHeiti" w:eastAsia="STHeiti" w:cs="STHeiti"/>
-                <w:b w:val="0"/>
-                <w:color w:val="1F2937"/>
-                <w:sz w:val="16"/>
-              </w:rPr>
-              <w:t>总量充足；须锁定每周课时和校历，避免 Y11T3 的 21 小时被活动或停课挤占。</w:t>
+              <w:rPr/>
+              <w:t>总量充足；锁定每周课时和校历。Y11T3 的 21 小时应保留为模拟、反馈与定向再教学，避免被活动或停课挤占。</w:t>
             </w:r>
           </w:p>
         </w:tc>
@@ -1335,18 +1321,11 @@
           </w:tcPr>
           <w:p>
             <w:pPr>
-              <w:spacing w:before="0" w:after="0" w:line="252" w:lineRule="auto"/>
               <w:jc w:val="left"/>
             </w:pPr>
-            <w:r/>
             <w:r>
-              <w:rPr>
-                <w:rFonts w:ascii="STHeiti" w:hAnsi="STHeiti" w:eastAsia="STHeiti" w:cs="STHeiti"/>
-                <w:b w:val="0"/>
-                <w:color w:val="1F2937"/>
-                <w:sz w:val="16"/>
-              </w:rPr>
-              <w:t>Y11T3 标为 Final revision，未列诊断、干预或模拟后的再教学。</w:t>
+              <w:rPr/>
+              <w:t>Y11T3 原标为“Final revision”，需明确说明复习期仍保留模拟后的诊断、定向再教学与再测。</w:t>
             </w:r>
           </w:p>
         </w:tc>
@@ -1372,18 +1351,11 @@
           </w:tcPr>
           <w:p>
             <w:pPr>
-              <w:spacing w:before="0" w:after="0" w:line="252" w:lineRule="auto"/>
               <w:jc w:val="left"/>
             </w:pPr>
-            <w:r/>
             <w:r>
-              <w:rPr>
-                <w:rFonts w:ascii="STHeiti" w:hAnsi="STHeiti" w:eastAsia="STHeiti" w:cs="STHeiti"/>
-                <w:b w:val="0"/>
-                <w:color w:val="1F2937"/>
-                <w:sz w:val="16"/>
-              </w:rPr>
-              <w:t>需细化</w:t>
+              <w:rPr/>
+              <w:t>需落实</w:t>
             </w:r>
           </w:p>
         </w:tc>
@@ -1409,18 +1381,11 @@
           </w:tcPr>
           <w:p>
             <w:pPr>
-              <w:spacing w:before="0" w:after="0" w:line="252" w:lineRule="auto"/>
               <w:jc w:val="left"/>
             </w:pPr>
-            <w:r/>
             <w:r>
-              <w:rPr>
-                <w:rFonts w:ascii="STHeiti" w:hAnsi="STHeiti" w:eastAsia="STHeiti" w:cs="STHeiti"/>
-                <w:b w:val="0"/>
-                <w:color w:val="1F2937"/>
-                <w:sz w:val="16"/>
-              </w:rPr>
-              <w:t>采用“模拟 诊断 微技能重教 再测”循环；按阅读、指导写作、文言、四类作文建立个人目标。</w:t>
+              <w:rPr/>
+              <w:t>采用“模拟一—48小时诊断—定向微技能再教学—模拟二—考前交接”循环；停止大型新单元，但不停止针对性教学。</w:t>
             </w:r>
           </w:p>
         </w:tc>
@@ -3320,18 +3285,11 @@
           </w:tcPr>
           <w:p>
             <w:pPr>
-              <w:spacing w:before="0" w:after="0" w:line="252" w:lineRule="auto"/>
               <w:jc w:val="left"/>
             </w:pPr>
-            <w:r/>
             <w:r>
-              <w:rPr>
-                <w:rFonts w:ascii="STHeiti" w:hAnsi="STHeiti" w:eastAsia="STHeiti" w:cs="STHeiti"/>
-                <w:b w:val="0"/>
-                <w:color w:val="1F2937"/>
-                <w:sz w:val="17"/>
-              </w:rPr>
-              <w:t>两轮完整模拟</w:t>
+              <w:rPr/>
+              <w:t>两轮完整模拟与间隔再教学</w:t>
             </w:r>
           </w:p>
         </w:tc>
@@ -3356,18 +3314,11 @@
           </w:tcPr>
           <w:p>
             <w:pPr>
-              <w:spacing w:before="0" w:after="0" w:line="252" w:lineRule="auto"/>
               <w:jc w:val="left"/>
             </w:pPr>
-            <w:r/>
             <w:r>
-              <w:rPr>
-                <w:rFonts w:ascii="STHeiti" w:hAnsi="STHeiti" w:eastAsia="STHeiti" w:cs="STHeiti"/>
-                <w:b w:val="0"/>
-                <w:color w:val="1F2937"/>
-                <w:sz w:val="17"/>
-              </w:rPr>
-              <w:t>每轮包含卷1和卷2，间隔再教学；第二轮用于验证改进，而非只给排名。</w:t>
+              <w:rPr/>
+              <w:t>每轮包含卷1和卷2；模拟后 48 小时内完成错因分类与个人目标。两轮之间安排定向再教学，第二轮用于验证改进。</w:t>
             </w:r>
           </w:p>
         </w:tc>
@@ -4849,29 +4800,12 @@
           </w:tcPr>
           <w:p>
             <w:pPr>
-              <w:spacing w:before="0" w:after="0" w:line="252" w:lineRule="auto"/>
               <w:jc w:val="left"/>
             </w:pPr>
-            <w:r/>
             <w:r>
-              <w:rPr>
-                <w:rFonts w:ascii="STHeiti" w:hAnsi="STHeiti" w:eastAsia="STHeiti" w:cs="STHeiti"/>
-                <w:b w:val="0"/>
-                <w:color w:val="1F2937"/>
-                <w:sz w:val="16"/>
-              </w:rPr>
-              <w:t>最终复习</w:t>
-            </w:r>
-            <w:r>
+              <w:rPr/>
+              <w:t>考前诊断、定向再教学与模拟</w:t>
               <w:br/>
-            </w:r>
-            <w:r>
-              <w:rPr>
-                <w:rFonts w:ascii="STHeiti" w:hAnsi="STHeiti" w:eastAsia="STHeiti" w:cs="STHeiti"/>
-                <w:b w:val="0"/>
-                <w:color w:val="1F2937"/>
-                <w:sz w:val="16"/>
-              </w:rPr>
               <w:t>历届或样题、学生错题、短篇陌生材料</w:t>
             </w:r>
           </w:p>
@@ -4897,18 +4831,11 @@
           </w:tcPr>
           <w:p>
             <w:pPr>
-              <w:spacing w:before="0" w:after="0" w:line="252" w:lineRule="auto"/>
               <w:jc w:val="left"/>
             </w:pPr>
-            <w:r/>
             <w:r>
-              <w:rPr>
-                <w:rFonts w:ascii="STHeiti" w:hAnsi="STHeiti" w:eastAsia="STHeiti" w:cs="STHeiti"/>
-                <w:b w:val="0"/>
-                <w:color w:val="1F2937"/>
-                <w:sz w:val="16"/>
-              </w:rPr>
-              <w:t>在真实时限下稳定完成两卷；按数据重教薄弱微技能；选择最适合的卷2题型。</w:t>
+              <w:rPr/>
+              <w:t>停止大型新单元；在真实时限下稳定完成两卷。根据数据重教阅读、指导写作、文言、卷2写作、校对与时间管理等微技能；选择最适合的卷2题型。</w:t>
             </w:r>
           </w:p>
         </w:tc>
@@ -4933,18 +4860,11 @@
           </w:tcPr>
           <w:p>
             <w:pPr>
-              <w:spacing w:before="0" w:after="0" w:line="252" w:lineRule="auto"/>
               <w:jc w:val="left"/>
             </w:pPr>
-            <w:r/>
             <w:r>
-              <w:rPr>
-                <w:rFonts w:ascii="STHeiti" w:hAnsi="STHeiti" w:eastAsia="STHeiti" w:cs="STHeiti"/>
-                <w:b w:val="0"/>
-                <w:color w:val="1F2937"/>
-                <w:sz w:val="16"/>
-              </w:rPr>
-              <w:t>两轮完整模拟（卷1与卷2各一份）；模拟后 48 小时内完成错因归类和针对性再写或再测。</w:t>
+              <w:rPr/>
+              <w:t>模拟一（6小时）→ 48小时内反馈与诊断（2小时）→ 定向再教学（7小时）→ 模拟二（5小时）→ 考前交接（1小时）。每轮含卷1与卷2；第二轮验证改进。</w:t>
             </w:r>
           </w:p>
         </w:tc>

</xml_diff>